<commit_message>
feat: add Task 3-5 tooling (tender_learn, sync_skill, regression), sync skill docs, add new examples
</commit_message>
<xml_diff>
--- a/_template.docx
+++ b/_template.docx
@@ -17,15 +17,6 @@
           <w:color w:val="auto"/>
         </w:rPr>
         <w:t xml:space="preserve">TENDER SPECIFICATION FOR [EQUIPMENT NAME]</w:t>
-      </w:r>
-    </w:p>
-    <w:p>
-      <w:pPr/>
-      <w:r>
-        <w:rPr>
-          <w:b/>
-        </w:rPr>
-        <w:t xml:space="preserve">Tender Ref.: RRCAT/[YEAR]/PUR/[XXX] | Date: [DD/MM/YYYY]</w:t>
       </w:r>
     </w:p>
     <w:p>
@@ -1480,7 +1471,7 @@
       <w:footnotePr>
         <w:numRestart w:val="eachSect"/>
       </w:footnotePr>
-      <w:pgSz w:w="12240" w:h="15840"/>
+      <w:pgSz w:w="11906" w:h="16838"/>
       <w:pgMar w:top="1440" w:right="1440" w:bottom="1440" w:left="1440" w:header="720" w:footer="720" w:gutter="0"/>
       <w:cols w:space="720"/>
     </w:sectPr>

</xml_diff>